<commit_message>
feat(docs): размечен diploma.docx тегами docxtpl
7 полей: catalog_number, sex_word, class_name, breed_line, dog_name,
owner, judge. Оценка/титулы оставлены пустыми (заполняются от руки, как
в бланке). Замена только содержимого w:t — форматирование сохранено.

Co-Authored-By: Claude Opus 4.8 <noreply@anthropic.com>
</commit_message>
<xml_diff>
--- a/app/templates/documents/diploma.docx
+++ b/app/templates/documents/diploma.docx
@@ -39,7 +39,7 @@
           <w:szCs w:val="36"/>
           <w:lang w:val="ru-RU"/>
         </w:rPr>
-        <w:t>020</w:t>
+        <w:t>{{ catalog_number }}</w:t>
       </w:r>
       <w:r>
         <w:rPr>
@@ -69,7 +69,7 @@
           <w:szCs w:val="36"/>
           <w:lang w:val="ru-RU"/>
         </w:rPr>
-        <w:t>Сука</w:t>
+        <w:t>{{ sex_word }}</w:t>
       </w:r>
       <w:r>
         <w:rPr>
@@ -116,7 +116,7 @@
           <w:szCs w:val="36"/>
           <w:lang w:val="ru-RU"/>
         </w:rPr>
-        <w:t>Юниоров</w:t>
+        <w:t>{{ class_name }}</w:t>
       </w:r>
     </w:p>
     <w:p>
@@ -165,7 +165,7 @@
           <w:szCs w:val="36"/>
           <w:lang w:val="ru-RU"/>
         </w:rPr>
-        <w:t>(FCI 327) РУССКИЙ ЧЁРНЫЙ ТЕРЬЕР</w:t>
+        <w:t>{{ breed_line }}</w:t>
       </w:r>
     </w:p>
     <w:p>
@@ -214,7 +214,7 @@
           <w:szCs w:val="36"/>
           <w:lang w:val="ru-RU"/>
         </w:rPr>
-        <w:t>СОЦВЕТИЕ АЛЕХАНДРА</w:t>
+        <w:t>{{ dog_name }}</w:t>
       </w:r>
     </w:p>
     <w:p>
@@ -254,7 +254,7 @@
           <w:szCs w:val="36"/>
           <w:lang w:val="ru-RU"/>
         </w:rPr>
-        <w:t>Караулова А.</w:t>
+        <w:t>{{ owner }}</w:t>
       </w:r>
     </w:p>
     <w:p>
@@ -343,7 +343,7 @@
           <w:szCs w:val="36"/>
           <w:lang w:val="ru-RU"/>
         </w:rPr>
-        <w:t>Мордвинова Татьяна Александровна</w:t>
+        <w:t>{{ judge }}</w:t>
       </w:r>
     </w:p>
     <w:p>

</xml_diff>